<commit_message>
removed pdf from system.info
</commit_message>
<xml_diff>
--- a/_site/jackyman_system.info.docx
+++ b/_site/jackyman_system.info.docx
@@ -23,7 +23,15 @@
         <w:pStyle w:val="Author"/>
       </w:pPr>
       <w:r>
-        <w:t xml:space="preserve">Your Name</w:t>
+        <w:t xml:space="preserve">Jacky Man</w:t>
+      </w:r>
+    </w:p>
+    <w:p>
+      <w:pPr>
+        <w:pStyle w:val="Date"/>
+      </w:pPr>
+      <w:r>
+        <w:t xml:space="preserve">March 21, 2026</w:t>
       </w:r>
     </w:p>
     <w:p>
@@ -438,7 +446,7 @@
         <w:rPr>
           <w:rStyle w:val="VerbatimChar"/>
         </w:rPr>
-        <w:t xml:space="preserve">Available Memory (MB): 2956.22</w:t>
+        <w:t xml:space="preserve">Available Memory (MB): 2680.69</w:t>
       </w:r>
     </w:p>
     <w:sectPr>

</xml_diff>